<commit_message>
feat: explore feed and user profile implementation
</commit_message>
<xml_diff>
--- a/Gameveloper.docx
+++ b/Gameveloper.docx
@@ -6626,6 +6626,224 @@
         <w:widowControl/>
         <w:suppressLineNumbers w:val="0"/>
         <w:ind w:left="720"/>
+      </w:pPr>
+      <w:r>
+        <w:rPr>
+          <w:b/>
+          <w:bCs/>
+        </w:rPr>
+        <w:t>Yorumlar:</w:t>
+      </w:r>
+      <w:r>
+        <w:t xml:space="preserve"> Her rehberin altında, o yol haritası hakkında teknik tartışmaların yapılabileceği bir yorum alanı bulunur. </w:t>
+      </w:r>
+    </w:p>
+    <w:p>
+      <w:pPr>
+        <w:pStyle w:val="3"/>
+        <w:keepNext w:val="0"/>
+        <w:keepLines w:val="0"/>
+        <w:widowControl/>
+        <w:suppressLineNumbers w:val="0"/>
+      </w:pPr>
+      <w:r>
+        <w:rPr>
+          <w:rFonts w:hint="default"/>
+          <w:b/>
+          <w:bCs/>
+          <w:lang w:val="tr-TR"/>
+        </w:rPr>
+        <w:t>9</w:t>
+      </w:r>
+      <w:r>
+        <w:rPr>
+          <w:b/>
+          <w:bCs/>
+        </w:rPr>
+        <w:t>.6. Keşfet (Explore / Global Feed) Modülü Yapısı</w:t>
+      </w:r>
+    </w:p>
+    <w:p>
+      <w:pPr>
+        <w:pStyle w:val="8"/>
+        <w:keepNext w:val="0"/>
+        <w:keepLines w:val="0"/>
+        <w:widowControl/>
+        <w:suppressLineNumbers w:val="0"/>
+      </w:pPr>
+      <w:r>
+        <w:t>Bu sayfa, platformun "kalbi" olup kullanıcının takip etmediği ama Trust Score'u yüksek veya ilgi alanlarına (Unity, Python, C# vb.) uygun olan en kaliteli içerikleri keşfetmesini sağlar.</w:t>
+      </w:r>
+    </w:p>
+    <w:p>
+      <w:pPr>
+        <w:pStyle w:val="8"/>
+        <w:keepNext w:val="0"/>
+        <w:keepLines w:val="0"/>
+        <w:widowControl/>
+        <w:suppressLineNumbers w:val="0"/>
+      </w:pPr>
+      <w:r>
+        <w:rPr>
+          <w:b/>
+          <w:bCs/>
+        </w:rPr>
+        <w:t>A. Dinamik Keşfet Filtreleri (Top Discovery Bar):</w:t>
+      </w:r>
+    </w:p>
+    <w:p>
+      <w:pPr>
+        <w:pStyle w:val="8"/>
+        <w:keepNext w:val="0"/>
+        <w:keepLines w:val="0"/>
+        <w:widowControl/>
+        <w:suppressLineNumbers w:val="0"/>
+        <w:ind w:left="720"/>
+      </w:pPr>
+      <w:r>
+        <w:rPr>
+          <w:b/>
+          <w:bCs/>
+        </w:rPr>
+        <w:t>Kategoriler:</w:t>
+      </w:r>
+      <w:r>
+        <w:t xml:space="preserve"> Çizimindeki sekmelerle uyumlu; "Trending", "Latest", "Unsolved (Çözüm Bekleyenler)" ve "Highly Rated (En Çok Beğenilenler)".</w:t>
+      </w:r>
+    </w:p>
+    <w:p>
+      <w:pPr>
+        <w:pStyle w:val="8"/>
+        <w:keepNext w:val="0"/>
+        <w:keepLines w:val="0"/>
+        <w:widowControl/>
+        <w:suppressLineNumbers w:val="0"/>
+        <w:ind w:left="720"/>
+      </w:pPr>
+      <w:r>
+        <w:rPr>
+          <w:b/>
+          <w:bCs/>
+        </w:rPr>
+        <w:t>Yapay Zeka Destekli Sıralama:</w:t>
+      </w:r>
+      <w:r>
+        <w:t xml:space="preserve"> İçerikler sadece tarihe göre değil, dökümandaki Trust Score algoritmasına göre (en güvenilir geliştiricilerin içerikleri en üstte) listelenir.</w:t>
+      </w:r>
+    </w:p>
+    <w:p>
+      <w:pPr>
+        <w:pStyle w:val="8"/>
+        <w:keepNext w:val="0"/>
+        <w:keepLines w:val="0"/>
+        <w:widowControl/>
+        <w:suppressLineNumbers w:val="0"/>
+      </w:pPr>
+      <w:r>
+        <w:rPr>
+          <w:b/>
+          <w:bCs/>
+        </w:rPr>
+        <w:t>B. Keşfet Akışı (Grid/Masonry Layout):</w:t>
+      </w:r>
+    </w:p>
+    <w:p>
+      <w:pPr>
+        <w:pStyle w:val="8"/>
+        <w:keepNext w:val="0"/>
+        <w:keepLines w:val="0"/>
+        <w:widowControl/>
+        <w:suppressLineNumbers w:val="0"/>
+        <w:ind w:left="720"/>
+      </w:pPr>
+      <w:r>
+        <w:rPr>
+          <w:b/>
+          <w:bCs/>
+        </w:rPr>
+        <w:t>İçerik Karışımı:</w:t>
+      </w:r>
+      <w:r>
+        <w:t xml:space="preserve"> Sorunlar, Fikirler ve Yol Haritaları bu akışta bir arada yer alır.</w:t>
+      </w:r>
+    </w:p>
+    <w:p>
+      <w:pPr>
+        <w:pStyle w:val="8"/>
+        <w:keepNext w:val="0"/>
+        <w:keepLines w:val="0"/>
+        <w:widowControl/>
+        <w:suppressLineNumbers w:val="0"/>
+        <w:ind w:left="720"/>
+      </w:pPr>
+      <w:r>
+        <w:rPr>
+          <w:b/>
+          <w:bCs/>
+        </w:rPr>
+        <w:t>Görsel Odak:</w:t>
+      </w:r>
+      <w:r>
+        <w:t xml:space="preserve"> Instagram keşfetine benzer şekilde, görseli (img) olan paylaşımlar daha geniş yer kaplar; görselsiz teknik sorular ise kompakt "kod kartları" şeklinde görünür.</w:t>
+      </w:r>
+    </w:p>
+    <w:p>
+      <w:pPr>
+        <w:pStyle w:val="8"/>
+        <w:keepNext w:val="0"/>
+        <w:keepLines w:val="0"/>
+        <w:widowControl/>
+        <w:suppressLineNumbers w:val="0"/>
+        <w:ind w:left="720"/>
+      </w:pPr>
+      <w:r>
+        <w:rPr>
+          <w:b/>
+          <w:bCs/>
+        </w:rPr>
+        <w:t>Hızlı Etkileşim:</w:t>
+      </w:r>
+      <w:r>
+        <w:t xml:space="preserve"> Kullanıcı içerik detayına gitmeden, akış üzerinden doğrudan "Upvote" yapabilir.</w:t>
+      </w:r>
+    </w:p>
+    <w:p>
+      <w:pPr>
+        <w:pStyle w:val="8"/>
+        <w:keepNext w:val="0"/>
+        <w:keepLines w:val="0"/>
+        <w:widowControl/>
+        <w:suppressLineNumbers w:val="0"/>
+      </w:pPr>
+      <w:r>
+        <w:rPr>
+          <w:b/>
+          <w:bCs/>
+        </w:rPr>
+        <w:t>C. "Sana Özel" (For You) Algoritması:</w:t>
+      </w:r>
+    </w:p>
+    <w:p>
+      <w:pPr>
+        <w:pStyle w:val="8"/>
+        <w:keepNext w:val="0"/>
+        <w:keepLines w:val="0"/>
+        <w:widowControl/>
+        <w:suppressLineNumbers w:val="0"/>
+        <w:ind w:left="720"/>
+      </w:pPr>
+      <w:r>
+        <w:t>Kullanıcının profilinde seçtiği yeteneklere (Örn: Blender, Flutter) göre, o araçlarla ilgili paylaşımlar akışta öncelikli gösterilir.</w:t>
+      </w:r>
+    </w:p>
+    <w:p>
+      <w:pPr>
+        <w:pStyle w:val="8"/>
+        <w:keepNext w:val="0"/>
+        <w:keepLines w:val="0"/>
+        <w:widowControl/>
+        <w:suppressLineNumbers w:val="0"/>
+        <w:ind w:left="720"/>
         <w:rPr>
           <w:rFonts w:hint="default"/>
           <w:lang w:val="tr-TR"/>
@@ -6633,16 +6851,414 @@
       </w:pPr>
       <w:r>
         <w:rPr>
+          <w:rFonts w:hint="default"/>
+          <w:lang w:val="tr-TR"/>
+        </w:rPr>
+        <w:t>#### **8.6. Keşfet Sayfası Nesne Standartları**</w:t>
+      </w:r>
+    </w:p>
+    <w:p>
+      <w:pPr>
+        <w:pStyle w:val="8"/>
+        <w:keepNext w:val="0"/>
+        <w:keepLines w:val="0"/>
+        <w:widowControl/>
+        <w:suppressLineNumbers w:val="0"/>
+        <w:ind w:left="720"/>
+        <w:rPr>
+          <w:rFonts w:hint="default"/>
+          <w:lang w:val="tr-TR"/>
+        </w:rPr>
+      </w:pPr>
+      <w:r>
+        <w:rPr>
+          <w:rFonts w:hint="default"/>
+          <w:lang w:val="tr-TR"/>
+        </w:rPr>
+        <w:t>1. **Global Feed Engine:** Tüm modüllerden (Sorunlar, Fikirler, Roadmaps) gelen veriler tek bir akışta birleştirilir.</w:t>
+      </w:r>
+    </w:p>
+    <w:p>
+      <w:pPr>
+        <w:pStyle w:val="8"/>
+        <w:keepNext w:val="0"/>
+        <w:keepLines w:val="0"/>
+        <w:widowControl/>
+        <w:suppressLineNumbers w:val="0"/>
+        <w:ind w:left="720"/>
+        <w:rPr>
+          <w:rFonts w:hint="default"/>
+          <w:lang w:val="tr-TR"/>
+        </w:rPr>
+      </w:pPr>
+      <w:r>
+        <w:rPr>
+          <w:rFonts w:hint="default"/>
+          <w:lang w:val="tr-TR"/>
+        </w:rPr>
+        <w:t>2. **Keşfet Kartları (Discovery Cards):**</w:t>
+      </w:r>
+    </w:p>
+    <w:p>
+      <w:pPr>
+        <w:pStyle w:val="8"/>
+        <w:keepNext w:val="0"/>
+        <w:keepLines w:val="0"/>
+        <w:widowControl/>
+        <w:suppressLineNumbers w:val="0"/>
+        <w:ind w:left="720"/>
+        <w:rPr>
+          <w:rFonts w:hint="default"/>
+          <w:lang w:val="tr-TR"/>
+        </w:rPr>
+      </w:pPr>
+      <w:r>
+        <w:rPr>
+          <w:rFonts w:hint="default"/>
+          <w:lang w:val="tr-TR"/>
+        </w:rPr>
+        <w:t xml:space="preserve">   - **Görsel Öncelik:** Görsel içeren paylaşımlarda, görsel kartın %60'ını kaplamalıdır.</w:t>
+      </w:r>
+    </w:p>
+    <w:p>
+      <w:pPr>
+        <w:pStyle w:val="8"/>
+        <w:keepNext w:val="0"/>
+        <w:keepLines w:val="0"/>
+        <w:widowControl/>
+        <w:suppressLineNumbers w:val="0"/>
+        <w:ind w:left="720"/>
+        <w:rPr>
+          <w:rFonts w:hint="default"/>
+          <w:lang w:val="tr-TR"/>
+        </w:rPr>
+      </w:pPr>
+      <w:r>
+        <w:rPr>
+          <w:rFonts w:hint="default"/>
+          <w:lang w:val="tr-TR"/>
+        </w:rPr>
+        <w:t xml:space="preserve">   - **Etiketler (Tags):** Her kartın altında içeriğin hangi teknolojiyle (Unity, Blender vb.) ilgili olduğu parlayan etiketlerle belirtilir.</w:t>
+      </w:r>
+    </w:p>
+    <w:p>
+      <w:pPr>
+        <w:pStyle w:val="8"/>
+        <w:keepNext w:val="0"/>
+        <w:keepLines w:val="0"/>
+        <w:widowControl/>
+        <w:numPr>
+          <w:ilvl w:val="0"/>
+          <w:numId w:val="1"/>
+        </w:numPr>
+        <w:suppressLineNumbers w:val="0"/>
+        <w:ind w:left="0" w:leftChars="0" w:firstLine="0" w:firstLineChars="0"/>
+        <w:rPr>
+          <w:rFonts w:hint="default"/>
+          <w:lang w:val="tr-TR"/>
+        </w:rPr>
+      </w:pPr>
+      <w:r>
+        <w:rPr>
+          <w:rFonts w:hint="default"/>
+          <w:lang w:val="tr-TR"/>
+        </w:rPr>
+        <w:t>**Rol Rozeti Görünürlüğü:** İçeriği paylaşan kişinin Trust Score ve Rol rozeti, kullanıcının güvenilirliğini ilk bakışta anlaması için kartın sol üstünde sabitlenir.</w:t>
+      </w:r>
+    </w:p>
+    <w:p>
+      <w:pPr>
+        <w:pStyle w:val="3"/>
+        <w:keepNext w:val="0"/>
+        <w:keepLines w:val="0"/>
+        <w:widowControl/>
+        <w:suppressLineNumbers w:val="0"/>
+      </w:pPr>
+      <w:r>
+        <w:rPr>
+          <w:rFonts w:hint="default"/>
+          <w:b/>
+          <w:bCs/>
+          <w:lang w:val="tr-TR"/>
+        </w:rPr>
+        <w:t>9</w:t>
+      </w:r>
+      <w:r>
+        <w:rPr>
+          <w:b/>
+          <w:bCs/>
+        </w:rPr>
+        <w:t>.7. Profil Sayfası (Developer Portfolio) Yapısı</w:t>
+      </w:r>
+    </w:p>
+    <w:p>
+      <w:pPr>
+        <w:pStyle w:val="8"/>
+        <w:keepNext w:val="0"/>
+        <w:keepLines w:val="0"/>
+        <w:widowControl/>
+        <w:suppressLineNumbers w:val="0"/>
+      </w:pPr>
+      <w:r>
+        <w:t xml:space="preserve">Profil sayfası, kullanıcının sadece kişisel bilgilerini değil; projelerini, teknik sorunlarını, çözümlerini ve topluluk tarafından onaylanmış başarılarını sergilediği profesyonel bir portfolyodur. </w:t>
+      </w:r>
+    </w:p>
+    <w:p>
+      <w:pPr>
+        <w:pStyle w:val="8"/>
+        <w:keepNext w:val="0"/>
+        <w:keepLines w:val="0"/>
+        <w:widowControl/>
+        <w:suppressLineNumbers w:val="0"/>
+      </w:pPr>
+      <w:r>
+        <w:rPr>
+          <w:b/>
+          <w:bCs/>
+        </w:rPr>
+        <w:t>A. Profil Üst Bilgisi (User Identity):</w:t>
+      </w:r>
+    </w:p>
+    <w:p>
+      <w:pPr>
+        <w:pStyle w:val="8"/>
+        <w:keepNext w:val="0"/>
+        <w:keepLines w:val="0"/>
+        <w:widowControl/>
+        <w:suppressLineNumbers w:val="0"/>
+        <w:ind w:left="720"/>
+      </w:pPr>
+      <w:r>
+        <w:rPr>
+          <w:b/>
+          <w:bCs/>
+        </w:rPr>
+        <w:t>Kullanıcı Bilgisi:</w:t>
+      </w:r>
+      <w:r>
+        <w:t xml:space="preserve"> En üstte büyük bir profil fotoğrafı (PP), kullanıcı adı (esmavkayaa) ve sağ üst köşede "Profil Ayarları" (üç nokta) menüsü.</w:t>
+      </w:r>
+    </w:p>
+    <w:p>
+      <w:pPr>
+        <w:pStyle w:val="8"/>
+        <w:keepNext w:val="0"/>
+        <w:keepLines w:val="0"/>
+        <w:widowControl/>
+        <w:suppressLineNumbers w:val="0"/>
+        <w:ind w:left="720"/>
+      </w:pPr>
+      <w:r>
+        <w:rPr>
+          <w:b/>
+          <w:bCs/>
+        </w:rPr>
+        <w:t>Trust Score &amp; Rol:</w:t>
+      </w:r>
+      <w:r>
+        <w:t xml:space="preserve"> Kullanıcının </w:t>
+      </w:r>
+      <w:r>
+        <w:rPr>
+          <w:rStyle w:val="7"/>
+        </w:rPr>
+        <w:t>DEVELOPER</w:t>
+      </w:r>
+      <w:r>
+        <w:t xml:space="preserve"> veya </w:t>
+      </w:r>
+      <w:r>
+        <w:rPr>
+          <w:rStyle w:val="7"/>
+        </w:rPr>
+        <w:t>GAMER</w:t>
+      </w:r>
+      <w:r>
+        <w:t xml:space="preserve"> rolü ve kazandığı toplam </w:t>
+      </w:r>
+      <w:r>
+        <w:rPr>
+          <w:rStyle w:val="7"/>
+        </w:rPr>
+        <w:t>trustScore</w:t>
+      </w:r>
+      <w:r>
+        <w:t xml:space="preserve"> en parlayan ve en belirgin şekilde bu alanda yer alır. </w:t>
+      </w:r>
+    </w:p>
+    <w:p>
+      <w:pPr>
+        <w:pStyle w:val="8"/>
+        <w:keepNext w:val="0"/>
+        <w:keepLines w:val="0"/>
+        <w:widowControl/>
+        <w:suppressLineNumbers w:val="0"/>
+      </w:pPr>
+      <w:r>
+        <w:rPr>
+          <w:b/>
+          <w:bCs/>
+        </w:rPr>
+        <w:t>B. İçerik Kategorizasyonu (Horizontal Menu):</w:t>
+      </w:r>
+      <w:r>
+        <w:t xml:space="preserve"> Çizimindeki o üçlü hiyerarşiyi dökümantasyona şu şekilde işleyelim:</w:t>
+      </w:r>
+    </w:p>
+    <w:p>
+      <w:pPr>
+        <w:pStyle w:val="8"/>
+        <w:keepNext w:val="0"/>
+        <w:keepLines w:val="0"/>
+        <w:widowControl/>
+        <w:suppressLineNumbers w:val="0"/>
+        <w:ind w:left="720"/>
+      </w:pPr>
+      <w:r>
+        <w:rPr>
+          <w:b/>
+          <w:bCs/>
+        </w:rPr>
+        <w:t>Paylaşılanlar:</w:t>
+      </w:r>
+      <w:r>
+        <w:t xml:space="preserve"> Projeler, İlerleme (Loglar), Kişisel Sorunlar, Fikirler ve Sunduğu Çözüm Önerileri. </w:t>
+      </w:r>
+    </w:p>
+    <w:p>
+      <w:pPr>
+        <w:pStyle w:val="8"/>
+        <w:keepNext w:val="0"/>
+        <w:keepLines w:val="0"/>
+        <w:widowControl/>
+        <w:suppressLineNumbers w:val="0"/>
+        <w:ind w:left="720"/>
+      </w:pPr>
+      <w:r>
+        <w:rPr>
+          <w:b/>
+          <w:bCs/>
+        </w:rPr>
+        <w:t>Beğenilenler:</w:t>
+      </w:r>
+      <w:r>
+        <w:t xml:space="preserve"> Kullanıcının takip ettiği ve beğendiği Fikirler, Projeler, Sorunlar ve Oyunlar.</w:t>
+      </w:r>
+    </w:p>
+    <w:p>
+      <w:pPr>
+        <w:pStyle w:val="8"/>
+        <w:keepNext w:val="0"/>
+        <w:keepLines w:val="0"/>
+        <w:widowControl/>
+        <w:suppressLineNumbers w:val="0"/>
+        <w:ind w:left="720"/>
+      </w:pPr>
+      <w:r>
+        <w:rPr>
           <w:b/>
           <w:bCs/>
         </w:rPr>
         <w:t>Yorumlar:</w:t>
       </w:r>
       <w:r>
-        <w:t xml:space="preserve"> Her rehberin altında, o yol haritası hakkında teknik tartışmaların yapılabileceği bir yorum alanı bulunur. </w:t>
+        <w:t xml:space="preserve"> Kullanıcının farklı konularda yaptığı teknik yorumlar ve en çok "Upvote" alan en kaliteli yanıtları.</w:t>
+      </w:r>
+    </w:p>
+    <w:p>
+      <w:pPr>
+        <w:pStyle w:val="8"/>
+        <w:keepNext w:val="0"/>
+        <w:keepLines w:val="0"/>
+        <w:widowControl/>
+        <w:suppressLineNumbers w:val="0"/>
+      </w:pPr>
+      <w:r>
+        <w:rPr>
+          <w:b/>
+          <w:bCs/>
+        </w:rPr>
+        <w:t>C. Dinamik Kart Yapısı (Grid/Timeline):</w:t>
+      </w:r>
+    </w:p>
+    <w:p>
+      <w:pPr>
+        <w:pStyle w:val="8"/>
+        <w:keepNext w:val="0"/>
+        <w:keepLines w:val="0"/>
+        <w:widowControl/>
+        <w:suppressLineNumbers w:val="0"/>
+        <w:ind w:left="720"/>
+      </w:pPr>
+      <w:r>
+        <w:rPr>
+          <w:b/>
+          <w:bCs/>
+        </w:rPr>
+        <w:t>İlerleme (Log) Kartı:</w:t>
+      </w:r>
+      <w:r>
+        <w:t xml:space="preserve"> Çizimindeki gibi; sol tarafta içerik tipi (İlerleme) ve tarih (27.03.2025), sağ tarafta ise "Oyunuma .... yenilikleri ekledim" metni ve yanında kaydırılabilir görsel/video paneli. </w:t>
+      </w:r>
+    </w:p>
+    <w:p>
+      <w:pPr>
+        <w:pStyle w:val="8"/>
+        <w:keepNext w:val="0"/>
+        <w:keepLines w:val="0"/>
+        <w:widowControl/>
+        <w:suppressLineNumbers w:val="0"/>
+        <w:ind w:left="720"/>
+      </w:pPr>
+      <w:r>
+        <w:rPr>
+          <w:b/>
+          <w:bCs/>
+        </w:rPr>
+        <w:t>Sorun Kartı:</w:t>
+      </w:r>
+      <w:r>
+        <w:t xml:space="preserve"> "Konuda sorun yaşadım" metni, ilg</w:t>
+      </w:r>
+      <w:r>
+        <w:rPr>
+          <w:rFonts w:hint="default"/>
+          <w:lang w:val="tr-TR"/>
+        </w:rPr>
+        <w:t>i</w:t>
+      </w:r>
+      <w:r>
+        <w:t xml:space="preserve">li görseller ve sağ alt köşede o soruna gelen çözüm önerilerini açan özel buton. </w:t>
+      </w:r>
+    </w:p>
+    <w:p>
+      <w:pPr>
+        <w:pStyle w:val="8"/>
+        <w:keepNext w:val="0"/>
+        <w:keepLines w:val="0"/>
+        <w:widowControl/>
+        <w:suppressLineNumbers w:val="0"/>
+        <w:ind w:left="720"/>
+        <w:rPr>
+          <w:rFonts w:hint="default"/>
+          <w:lang w:val="tr-TR"/>
+        </w:rPr>
+      </w:pPr>
+      <w:r>
+        <w:rPr>
+          <w:b/>
+          <w:bCs/>
+        </w:rPr>
+        <w:t>Etkileşim Çubuğu:</w:t>
+      </w:r>
+      <w:r>
+        <w:t xml:space="preserve"> Her bir profil öğesini</w:t>
       </w:r>
       <w:bookmarkStart w:id="0" w:name="_GoBack"/>
       <w:bookmarkEnd w:id="0"/>
+      <w:r>
+        <w:t>n altında Beğeni, Yorum ve Paylaşım sayılarını gösteren ikonik bar.</w:t>
+      </w:r>
     </w:p>
     <w:sectPr>
       <w:pgSz w:w="11906" w:h="16838"/>

</xml_diff>